<commit_message>
fix: correct typo 'autidoria' to 'auditoria' in user manual and 'npm.cmd' to 'npm' in tech manual
</commit_message>
<xml_diff>
--- a/docs/manual-tecnico.docx
+++ b/docs/manual-tecnico.docx
@@ -23878,7 +23878,7 @@
           <w:rFonts w:ascii="Arial" w:hAnsi="Arial" w:cs="Arial"/>
           <w:sz w:val="22"/>
         </w:rPr>
-        <w:t xml:space="preserve">npm.cmd run </w:t>
+        <w:t xml:space="preserve">npm run </w:t>
       </w:r>
       <w:proofErr w:type="spellStart"/>
       <w:r>
@@ -23895,7 +23895,7 @@
           <w:sz w:val="22"/>
         </w:rPr>
         <w:br/>
-        <w:t>npm.cmd test</w:t>
+        <w:t>npm test</w:t>
       </w:r>
       <w:r>
         <w:rPr>
@@ -23903,7 +23903,7 @@
           <w:sz w:val="22"/>
         </w:rPr>
         <w:br/>
-        <w:t>npm.cmd run lint</w:t>
+        <w:t>npm run lint</w:t>
       </w:r>
       <w:r>
         <w:rPr>
@@ -23911,7 +23911,7 @@
           <w:sz w:val="22"/>
         </w:rPr>
         <w:br/>
-        <w:t>npm.cmd run build</w:t>
+        <w:t>npm run build</w:t>
       </w:r>
     </w:p>
     <w:p>

</xml_diff>